<commit_message>
Consolidate the report: team drafts (Business, Industry, ESG beta 3) in the main two-column format, shared draft importer, single figure/appendix numbering and key-data summary page
Co-Authored-By: Claude Opus 5.5 <noreply@anthropic.com>
Claude-Session: https://claude.ai/code/session_0188QZHBkA8n5QL7BtmFakQg
</commit_message>
<xml_diff>
--- a/secciones/esg/documento/Mallplaza_ESG_ES.docx
+++ b/secciones/esg/documento/Mallplaza_ESG_ES.docx
@@ -18,23 +18,7 @@
           <w:sz w:val="30"/>
           <w:szCs w:val="30"/>
         </w:rPr>
-        <w:t xml:space="preserve">AMBIENTAL, SOCIAL Y GOBIERNO CORPORATIVO (ESG)</w:t>
-      </w:r>
-    </w:p>
-    <w:p>
-      <w:pPr>
-        <w:shd w:fill="EEF1F6" w:color="auto" w:val="clear"/>
-        <w:spacing w:after="80" w:line="228" w:lineRule="auto"/>
-        <w:jc w:val="both"/>
-      </w:pPr>
-      <w:r>
-        <w:rPr>
-          <w:rFonts w:ascii="Arial" w:cs="Arial" w:eastAsia="Arial" w:hAnsi="Arial"/>
-          <w:color w:val="1A1A1A"/>
-          <w:sz w:val="16"/>
-          <w:szCs w:val="16"/>
-        </w:rPr>
-        <w:t xml:space="preserve">El enfoque ESG de Plaza es transversal a todas sus decisiones: busca desarrollar su modelo de negocios respetando los parámetros ESG y contribuir a un desarrollo sostenible, lo que además le abre beneficios financieros externos y de su propia operación. Bloomberg califica a la compañía con 3,39 puntos (Figura E1), bajo la media de la industria a nivel global (5–6 puntos) y de su competencia directa en Chile; esto contrasta con su perfil “verde” local, donde figura entre las principales empresas inmobiliarias (REM) de la región.</w:t>
+        <w:t xml:space="preserve">ENVIROMENTAL, SOCIAL AND GOVERNANCE (ESG)</w:t>
       </w:r>
     </w:p>
     <w:tbl>
@@ -55,9 +39,6 @@
         <w:gridCol w:w="3550"/>
       </w:tblGrid>
       <w:tr>
-        <w:trPr>
-          <w:cantSplit/>
-        </w:trPr>
         <w:tc>
           <w:tcPr>
             <w:tcW w:type="dxa" w:w="6900"/>
@@ -83,22 +64,37 @@
             <w:r>
               <w:rPr>
                 <w:rFonts w:ascii="Arial" w:cs="Arial" w:eastAsia="Arial" w:hAnsi="Arial"/>
-                <w:b/>
-                <w:bCs/>
-                <w:color w:val="14284B"/>
-                <w:sz w:val="16"/>
-                <w:szCs w:val="16"/>
-              </w:rPr>
-              <w:t xml:space="preserve">Beneficios financieros potenciales:</w:t>
-            </w:r>
-            <w:r>
-              <w:rPr>
-                <w:rFonts w:ascii="Arial" w:cs="Arial" w:eastAsia="Arial" w:hAnsi="Arial"/>
+                <w:i w:val="false"/>
+                <w:iCs w:val="false"/>
                 <w:color w:val="1A1A1A"/>
                 <w:sz w:val="16"/>
                 <w:szCs w:val="16"/>
               </w:rPr>
-              <w:t xml:space="preserve"> el sistema de gestión de la energía (SGE) certificado bajo la ISO 50001 mejora el desempeño energético y reduce los costos operativos. Los beneficios externos dependen de su imagen ESG: en Chile, la Ley I+D (CORFO) permite descontar del impuesto de primera categoría el 35% de lo invertido en investigación y desarrollo (hasta 52,55% del total, sumando el gasto); en Perú, el reconocimiento de “Huella Perú” (2 de 4 estrellas) facilita la obtención de permisos y licencias; y en Colombia, la Ley 2099 de 2021 permite descontar de la renta las inversiones en control, conservación y mejoramiento del medio ambiente.</w:t>
+              <w:t xml:space="preserve">El enfoque ESG de PLAZA es transversal en todas sus decisiones organizacionales, con el objetivo de desarrollar su modelo de negocios respetando los parámetros ESG y así contribuir a un desarrollo sostenible, lo que le da oportunidad de optar a beneficios financieros externos y de su propia operación. Respecto al cumplimiento de dichos parámetros, Bloomberg califica a la empresa con 3.39 puntos, lo que está por debajo de la media (5-6 pts) de la industria a nivel global y de su competencia directa en Chile (figura E1), pero esto se contra resta con el perfil “verde” de la empresa a nivel local, ya que esta figura como una de las principales REM a nivel regional. </w:t>
+            </w:r>
+            <w:r>
+              <w:rPr>
+                <w:rFonts w:ascii="Arial" w:cs="Arial" w:eastAsia="Arial" w:hAnsi="Arial"/>
+                <w:b/>
+                <w:bCs/>
+                <w:i w:val="false"/>
+                <w:iCs w:val="false"/>
+                <w:color w:val="14284B"/>
+                <w:sz w:val="16"/>
+                <w:szCs w:val="16"/>
+              </w:rPr>
+              <w:t xml:space="preserve">Potential financial benefits:</w:t>
+            </w:r>
+            <w:r>
+              <w:rPr>
+                <w:rFonts w:ascii="Arial" w:cs="Arial" w:eastAsia="Arial" w:hAnsi="Arial"/>
+                <w:i w:val="false"/>
+                <w:iCs w:val="false"/>
+                <w:color w:val="1A1A1A"/>
+                <w:sz w:val="16"/>
+                <w:szCs w:val="16"/>
+              </w:rPr>
+              <w:t xml:space="preserve"> En cuanto a los beneficios propios de la operación, la implementación de un sistema de gestión de la energía (SGE) certificado por la ISO 50.001, se traduce en un mejor desempeño energético, por ende, en una reducción de costos operativos. Las oportunidades de optar a beneficios externos locales van ligadas a la imagen ESG de la empresa, en Chile existe la ley de I+D (CORFO) dónde PLAZA puede alcanzar hasta un 55% de rebaja de impuestos de 1ª categoría; Perú reconoce a la empresa con 2 estrellas de 4 en “Huella de Carbono Perú”, lo que aporta a la imagen de la empresa para obtener más fácilmente permisos y licencias dentro del país, y Colombia tiene la ley 2.099 de 2021, que permite obtener descuentos aplicables a la renta por inversiones en control, conservación y mejoramiento del medio ambiente.</w:t>
             </w:r>
           </w:p>
           <w:p>
@@ -106,18 +102,18 @@
               <w:pBdr>
                 <w:bottom w:val="single" w:color="E9004B" w:sz="8" w:space="1"/>
               </w:pBdr>
-              <w:spacing w:after="50" w:before="110"/>
-            </w:pPr>
-            <w:r>
-              <w:rPr>
-                <w:rFonts w:ascii="Arial" w:cs="Arial" w:eastAsia="Arial" w:hAnsi="Arial"/>
-                <w:b/>
-                <w:bCs/>
-                <w:color w:val="14284B"/>
-                <w:sz w:val="16"/>
-                <w:szCs w:val="16"/>
-              </w:rPr>
-              <w:t xml:space="preserve">AMBIENTAL</w:t>
+              <w:spacing w:after="50" w:before="90"/>
+            </w:pPr>
+            <w:r>
+              <w:rPr>
+                <w:rFonts w:ascii="Arial" w:cs="Arial" w:eastAsia="Arial" w:hAnsi="Arial"/>
+                <w:b/>
+                <w:bCs/>
+                <w:color w:val="14284B"/>
+                <w:sz w:val="16"/>
+                <w:szCs w:val="16"/>
+              </w:rPr>
+              <w:t xml:space="preserve">ENVIROMENTAL</w:t>
             </w:r>
           </w:p>
           <w:p>
@@ -128,101 +124,93 @@
             <w:r>
               <w:rPr>
                 <w:rFonts w:ascii="Arial" w:cs="Arial" w:eastAsia="Arial" w:hAnsi="Arial"/>
+                <w:i w:val="false"/>
+                <w:iCs w:val="false"/>
                 <w:color w:val="1A1A1A"/>
                 <w:sz w:val="16"/>
                 <w:szCs w:val="16"/>
               </w:rPr>
-              <w:t xml:space="preserve">El enfoque de Plaza es una gestión operativa eficiente, sustentable y circular, con tres focos estratégicos: eficiencia energética e hídrica, huella de carbono y gestión de residuos. Su principal objetivo es la carbono neutralidad, con la meta de ser Net Zero en emisiones directas e indirectas al 2035 (65,6% de avance en 2025).</w:t>
-            </w:r>
-          </w:p>
-          <w:p>
-            <w:pPr>
-              <w:spacing w:after="60" w:before="0" w:line="228" w:lineRule="auto"/>
-              <w:jc w:val="both"/>
-            </w:pPr>
-            <w:r>
-              <w:rPr>
-                <w:rFonts w:ascii="Arial" w:cs="Arial" w:eastAsia="Arial" w:hAnsi="Arial"/>
-                <w:b/>
-                <w:bCs/>
-                <w:color w:val="14284B"/>
-                <w:sz w:val="16"/>
-                <w:szCs w:val="16"/>
-              </w:rPr>
-              <w:t xml:space="preserve">Índices de sostenibilidad:</w:t>
-            </w:r>
-            <w:r>
-              <w:rPr>
-                <w:rFonts w:ascii="Arial" w:cs="Arial" w:eastAsia="Arial" w:hAnsi="Arial"/>
+              <w:t xml:space="preserve">El enfoque de PLAZA es lograr una gestión operativa eficiente, sustentable y circular en base a la mejora continua del desempeño ambiental, para esto han fijado tres focos de acción estratégica sobre los parámetros ESG, los cuales son: Eficiencia energética e hídrica, huella de carbono y gestión de residuos. El principal objetivo de PLAZA es alcanzar la carbono neutralidad, estableciendo una proyección de ser Net Zero en emisiones de directas e indirectas para 2035 (65.6% succes rate 2025). </w:t>
+            </w:r>
+            <w:r>
+              <w:rPr>
+                <w:rFonts w:ascii="Arial" w:cs="Arial" w:eastAsia="Arial" w:hAnsi="Arial"/>
+                <w:b/>
+                <w:bCs/>
+                <w:i w:val="false"/>
+                <w:iCs w:val="false"/>
+                <w:color w:val="14284B"/>
+                <w:sz w:val="16"/>
+                <w:szCs w:val="16"/>
+              </w:rPr>
+              <w:t xml:space="preserve">Sustentability índices:</w:t>
+            </w:r>
+            <w:r>
+              <w:rPr>
+                <w:rFonts w:ascii="Arial" w:cs="Arial" w:eastAsia="Arial" w:hAnsi="Arial"/>
+                <w:i w:val="false"/>
+                <w:iCs w:val="false"/>
                 <w:color w:val="1A1A1A"/>
                 <w:sz w:val="16"/>
                 <w:szCs w:val="16"/>
               </w:rPr>
-              <w:t xml:space="preserve"> la compañía está en el DJSI Chile y el DJSI MILA, y es la única empresa inmobiliaria (REM) de Sudamérica en el MSCI ESG, con clasificación “BBB”, lo que le da exposición a ETFs. Además, forma parte del S&amp;P Global Sustainability Yearbook y Morningstar Sustainalytics le asigna un riesgo ESG de 14,4 (bajo) (Figura E1).</w:t>
-            </w:r>
-          </w:p>
-          <w:p>
-            <w:pPr>
-              <w:spacing w:after="60" w:before="0" w:line="228" w:lineRule="auto"/>
-              <w:jc w:val="both"/>
-            </w:pPr>
-            <w:r>
-              <w:rPr>
-                <w:rFonts w:ascii="Arial" w:cs="Arial" w:eastAsia="Arial" w:hAnsi="Arial"/>
-                <w:b/>
-                <w:bCs/>
-                <w:color w:val="14284B"/>
-                <w:sz w:val="16"/>
-                <w:szCs w:val="16"/>
-              </w:rPr>
-              <w:t xml:space="preserve">Energía:</w:t>
-            </w:r>
-            <w:r>
-              <w:rPr>
-                <w:rFonts w:ascii="Arial" w:cs="Arial" w:eastAsia="Arial" w:hAnsi="Arial"/>
+              <w:t xml:space="preserve"> La compañía está presente en DJSI Chile, DJSI MILA y es la única empresa REM de Sudamérica en ser parte del MSCI ESG, con una clasificación de “BBB”, lo que le da exposición a ETF’s, por otra parte, tiene los siguientes reconocimientos: S&amp;P Sustentability Yearbook ; Morningstar Sustainalytics le da una calificación de 14.4 de riesgo y Huella de Carbono Perú (2/4 estrellas), lo que aporta a su imagen ESG. </w:t>
+            </w:r>
+            <w:r>
+              <w:rPr>
+                <w:rFonts w:ascii="Arial" w:cs="Arial" w:eastAsia="Arial" w:hAnsi="Arial"/>
+                <w:b/>
+                <w:bCs/>
+                <w:i w:val="false"/>
+                <w:iCs w:val="false"/>
+                <w:color w:val="14284B"/>
+                <w:sz w:val="16"/>
+                <w:szCs w:val="16"/>
+              </w:rPr>
+              <w:t xml:space="preserve">Energy:</w:t>
+            </w:r>
+            <w:r>
+              <w:rPr>
+                <w:rFonts w:ascii="Arial" w:cs="Arial" w:eastAsia="Arial" w:hAnsi="Arial"/>
+                <w:i w:val="false"/>
+                <w:iCs w:val="false"/>
                 <w:color w:val="1A1A1A"/>
                 <w:sz w:val="16"/>
                 <w:szCs w:val="16"/>
               </w:rPr>
-              <w:t xml:space="preserve"> la meta es reducir 22% la intensidad energética del gasto común al 2035 (35,5% de avance) y abastecerse con 100% de electricidad renovable al 2026 (89,3% de avance) (Figura E2). En 2025 la energía renovable representó el 90,9% del consumo total de 373.860 MWh (Figura E3), con una intensidad de 0,16 MWh/m² de GLA (0,14 renovable y 0,014 no renovable).</w:t>
-            </w:r>
-          </w:p>
-          <w:p>
-            <w:pPr>
-              <w:spacing w:after="60" w:before="0" w:line="228" w:lineRule="auto"/>
-              <w:jc w:val="both"/>
-            </w:pPr>
-            <w:r>
-              <w:rPr>
-                <w:rFonts w:ascii="Arial" w:cs="Arial" w:eastAsia="Arial" w:hAnsi="Arial"/>
-                <w:b/>
-                <w:bCs/>
-                <w:color w:val="14284B"/>
-                <w:sz w:val="16"/>
-                <w:szCs w:val="16"/>
-              </w:rPr>
-              <w:t xml:space="preserve">Agua:</w:t>
-            </w:r>
-            <w:r>
-              <w:rPr>
-                <w:rFonts w:ascii="Arial" w:cs="Arial" w:eastAsia="Arial" w:hAnsi="Arial"/>
+              <w:t xml:space="preserve"> PLAZA se ha propuesto disminuir en un 22% la intensidad energética del gasto común para el 2035 (35.5% succes rate 2025; figura E2). La meta propuesta de eficiencia eléctrica es que el 100% sea de energías renovables en 2026 (89.3% succes rate). En 2025 la proporción anual fue 0.16 MWh/m2 (Energía/GLA), siendo 0.14 renovable y 0.014 no renovable) (figura E3).</w:t>
+            </w:r>
+            <w:r>
+              <w:rPr>
+                <w:rFonts w:ascii="Arial" w:cs="Arial" w:eastAsia="Arial" w:hAnsi="Arial"/>
+                <w:b/>
+                <w:bCs/>
+                <w:i w:val="false"/>
+                <w:iCs w:val="false"/>
+                <w:color w:val="14284B"/>
+                <w:sz w:val="16"/>
+                <w:szCs w:val="16"/>
+              </w:rPr>
+              <w:t xml:space="preserve"> Water:</w:t>
+            </w:r>
+            <w:r>
+              <w:rPr>
+                <w:rFonts w:ascii="Arial" w:cs="Arial" w:eastAsia="Arial" w:hAnsi="Arial"/>
+                <w:i w:val="false"/>
+                <w:iCs w:val="false"/>
                 <w:color w:val="1A1A1A"/>
                 <w:sz w:val="16"/>
                 <w:szCs w:val="16"/>
               </w:rPr>
-              <w:t xml:space="preserve"> la meta de reducir 30% el consumo directo de agua al 2025 se cumplió en 100,9%, apoyada por las certificaciones LEED y EDGE. En 2025 la intensidad fue de 0,77 m³/m² de GLA.</w:t>
-            </w:r>
-          </w:p>
-          <w:p>
-            <w:pPr>
-              <w:spacing w:after="60" w:before="0" w:line="228" w:lineRule="auto"/>
-              <w:jc w:val="both"/>
-            </w:pPr>
-            <w:r>
-              <w:rPr>
-                <w:rFonts w:ascii="Arial" w:cs="Arial" w:eastAsia="Arial" w:hAnsi="Arial"/>
-                <w:b/>
-                <w:bCs/>
+              <w:t xml:space="preserve"> Fijó el objetivo en disminuir en un 30% el consumo directo de agua para 2025, lo que se logró en un 100,9% esto se ve influenciado por sus certificaciones LEED y EDGGE. En 2025 la proporción anual fue 0.77 m3/m2 (Agua/GLA) y 0.66 m3/m2 mensual en diciembre. </w:t>
+            </w:r>
+            <w:r>
+              <w:rPr>
+                <w:rFonts w:ascii="Arial" w:cs="Arial" w:eastAsia="Arial" w:hAnsi="Arial"/>
+                <w:b/>
+                <w:bCs/>
+                <w:i w:val="false"/>
+                <w:iCs w:val="false"/>
                 <w:color w:val="14284B"/>
                 <w:sz w:val="16"/>
                 <w:szCs w:val="16"/>
@@ -232,63 +220,37 @@
             <w:r>
               <w:rPr>
                 <w:rFonts w:ascii="Arial" w:cs="Arial" w:eastAsia="Arial" w:hAnsi="Arial"/>
+                <w:i w:val="false"/>
+                <w:iCs w:val="false"/>
                 <w:color w:val="1A1A1A"/>
                 <w:sz w:val="16"/>
                 <w:szCs w:val="16"/>
               </w:rPr>
-              <w:t xml:space="preserve"> busca eliminar el 100% de su uso al 2030 (14,9% de avance), clave para la gestión de emisiones de gases de efecto invernadero, ámbito en el que Bloomberg reconoce a Plaza como líder de la industria global.</w:t>
-            </w:r>
-          </w:p>
-          <w:p>
-            <w:pPr>
-              <w:spacing w:after="60" w:before="0" w:line="228" w:lineRule="auto"/>
-              <w:jc w:val="both"/>
-            </w:pPr>
-            <w:r>
-              <w:rPr>
-                <w:rFonts w:ascii="Arial" w:cs="Arial" w:eastAsia="Arial" w:hAnsi="Arial"/>
-                <w:b/>
-                <w:bCs/>
-                <w:color w:val="14284B"/>
-                <w:sz w:val="16"/>
-                <w:szCs w:val="16"/>
-              </w:rPr>
-              <w:t xml:space="preserve">Residuos:</w:t>
-            </w:r>
-            <w:r>
-              <w:rPr>
-                <w:rFonts w:ascii="Arial" w:cs="Arial" w:eastAsia="Arial" w:hAnsi="Arial"/>
+              <w:t xml:space="preserve"> Estableció el objetivo de eliminar el 100% del uso de HCFC para 2030 (14.9% succes rate 2025), esto es vital para la gestión de emisiones GEI, dónde Bloomberg reconoce a PLAZA como Líder de la industria global. Waste: PLAZA propuso un 60% de valorización de residuos generados el 2025 (94.8% succes rate; figura E3 y Anexo [Y], figura S4), además de buscar desviar el 75% de residuos sólidos de los vertederos para el 2027. Informa haber eliminado el 97% de los plásticos de un solo uso de la operación. </w:t>
+            </w:r>
+            <w:r>
+              <w:rPr>
+                <w:rFonts w:ascii="Arial" w:cs="Arial" w:eastAsia="Arial" w:hAnsi="Arial"/>
+                <w:b/>
+                <w:bCs/>
+                <w:i w:val="false"/>
+                <w:iCs w:val="false"/>
+                <w:color w:val="14284B"/>
+                <w:sz w:val="16"/>
+                <w:szCs w:val="16"/>
+              </w:rPr>
+              <w:t xml:space="preserve">Climate management: </w:t>
+            </w:r>
+            <w:r>
+              <w:rPr>
+                <w:rFonts w:ascii="Arial" w:cs="Arial" w:eastAsia="Arial" w:hAnsi="Arial"/>
+                <w:i w:val="false"/>
+                <w:iCs w:val="false"/>
                 <w:color w:val="1A1A1A"/>
                 <w:sz w:val="16"/>
                 <w:szCs w:val="16"/>
               </w:rPr>
-              <w:t xml:space="preserve"> la meta de valorizar el 60% de los residuos al 2025 registra un avance de 94,8%; además, busca desviar de los vertederos el 75% de los residuos sólidos al 2027 y ya eliminó el 97% de los plásticos de un solo uso de la operación. En 2025 valorizó el 46,2% de sus residuos no peligrosos (Figura E3).</w:t>
-            </w:r>
-          </w:p>
-          <w:p>
-            <w:pPr>
-              <w:spacing w:after="60" w:before="0" w:line="228" w:lineRule="auto"/>
-              <w:jc w:val="both"/>
-            </w:pPr>
-            <w:r>
-              <w:rPr>
-                <w:rFonts w:ascii="Arial" w:cs="Arial" w:eastAsia="Arial" w:hAnsi="Arial"/>
-                <w:b/>
-                <w:bCs/>
-                <w:color w:val="14284B"/>
-                <w:sz w:val="16"/>
-                <w:szCs w:val="16"/>
-              </w:rPr>
-              <w:t xml:space="preserve">Gestión climática:</w:t>
-            </w:r>
-            <w:r>
-              <w:rPr>
-                <w:rFonts w:ascii="Arial" w:cs="Arial" w:eastAsia="Arial" w:hAnsi="Arial"/>
-                <w:color w:val="1A1A1A"/>
-                <w:sz w:val="16"/>
-                <w:szCs w:val="16"/>
-              </w:rPr>
-              <w:t xml:space="preserve"> Plaza adopta las recomendaciones TCFD para integrar los riesgos físicos y de transición, realiza un due diligence ambiental en la adquisición de activos y opera bajo un programa de cumplimiento ambiental alineado con la ISO 14001, monitoreado por el comité de sustentabilidad.</w:t>
+              <w:t xml:space="preserve">PLAZA adopta las recomendaciones TCFD para integrar los riesgos físicos y de transición, acompañado de un Due Diligence ambiental en adquisiciones de activos, esto bajo el programa de cumplimiento ambiental alineado con la ISO 14.001 y monitoreado por el comité de sustentabilidad.</w:t>
             </w:r>
           </w:p>
           <w:p>
@@ -296,7 +258,7 @@
               <w:pBdr>
                 <w:bottom w:val="single" w:color="E9004B" w:sz="8" w:space="1"/>
               </w:pBdr>
-              <w:spacing w:after="50" w:before="110"/>
+              <w:spacing w:after="50" w:before="90"/>
             </w:pPr>
             <w:r>
               <w:rPr>
@@ -318,11 +280,13 @@
             <w:r>
               <w:rPr>
                 <w:rFonts w:ascii="Arial" w:cs="Arial" w:eastAsia="Arial" w:hAnsi="Arial"/>
+                <w:i w:val="false"/>
+                <w:iCs w:val="false"/>
                 <w:color w:val="1A1A1A"/>
                 <w:sz w:val="16"/>
                 <w:szCs w:val="16"/>
               </w:rPr>
-              <w:t xml:space="preserve">La compañía aborda el ámbito social con un modelo de relación ética de largo plazo, basado en la creación de valor compartido, que pone a sus grupos de interés en el centro de su estrategia, alineado con la ISO 45001 y las directrices de la OIT. En 2025 incorporó un programa de detección y respuesta ante riesgos de su política de derechos humanos. Gestiona a sus grupos de interés con mecanismos como diálogos comunitarios y evaluaciones de materialidad (Anexo [Y]) y atiende cualquier incidencia social a través de su canal de integridad. Cadem la ubicó en el puesto 31 de 365 “Marcas Ciudadanas” y ganadora de la categoría Centros Comerciales (2026). En 2025 sus programas y proyectos impactaron positivamente a 49.325 personas (Figura E4).</w:t>
+              <w:t xml:space="preserve">La compañía plantea el ámbito social mediante un modelo enfocado a la relación ética de largo plazo, como un principio de creación de valor compartido situando a las personas de sus grupos de interés en el centro de su estrategia alineado con la ISO 45.001 y las directrices de la OIT, incorporando en 2025 el programa de detección y respuesta ante riesgos de su política de derechos humanos, de esta forma PLAZA gestiona sus stakeholders asegurando una vinculación transparente, utilizando mecanismos como diálogos comunitarios y evaluaciones de materialidad (Anexo [Y], figura S3), estando alerta a cualquier incidencia social a través de su canal de integridad, además de ser reconocido por CADEM en el puesto 31 de 385 “Marcas Ciudadanas”, siendo ganadora de la categoría “Centros Comerciales” (2026). Respecto a los empleados, estos son capacitados e incluso tienen disposición de programas específicos para quienes están por jubilarse (Anexo [Y], sección 5), además de evaluar a sus proveedores con criterios de sostenibilidad (55.3% de los proveedores regionales y 38,4% de los extranjeros). PLAZA gestiona la relación con sus clientes (arrendatarios) a través de un modelo de relacionamiento enfocado en la propuesta de valor y experiencia, evaluando la satisfacción de estos con la medición NPS, donde en 2025 aumentó a 13% (figura E4). Para gestionar emergencias, cada centro cuenta con manuales de emergencias adaptados a los contextos geográficos locales, ejecutando simulacros para prevenir y educar a la comunidad (en 2025 se ejecutaron 52 simulacros) y en cuanto a la privacidad, PLAZA implemento la ISO/IEC 27.001, asegurando la confidencialidad, integridad y disponibilidad de la información ante riesgos cibernéticos.</w:t>
             </w:r>
           </w:p>
           <w:p>
@@ -333,100 +297,13 @@
             <w:r>
               <w:rPr>
                 <w:rFonts w:ascii="Arial" w:cs="Arial" w:eastAsia="Arial" w:hAnsi="Arial"/>
-                <w:b/>
-                <w:bCs/>
-                <w:color w:val="14284B"/>
-                <w:sz w:val="16"/>
-                <w:szCs w:val="16"/>
-              </w:rPr>
-              <w:t xml:space="preserve">Colaboradores y proveedores:</w:t>
-            </w:r>
-            <w:r>
-              <w:rPr>
-                <w:rFonts w:ascii="Arial" w:cs="Arial" w:eastAsia="Arial" w:hAnsi="Arial"/>
+                <w:i w:val="false"/>
+                <w:iCs w:val="false"/>
                 <w:color w:val="1A1A1A"/>
                 <w:sz w:val="16"/>
                 <w:szCs w:val="16"/>
               </w:rPr>
-              <w:t xml:space="preserve"> capacita a sus trabajadores, ofrece programas para quienes se acercan a la jubilación y evalúa a sus proveedores con criterios de sostenibilidad (55,3% de los proveedores locales y 38,4% de los extranjeros).</w:t>
-            </w:r>
-          </w:p>
-          <w:p>
-            <w:pPr>
-              <w:spacing w:after="60" w:before="0" w:line="228" w:lineRule="auto"/>
-              <w:jc w:val="both"/>
-            </w:pPr>
-            <w:r>
-              <w:rPr>
-                <w:rFonts w:ascii="Arial" w:cs="Arial" w:eastAsia="Arial" w:hAnsi="Arial"/>
-                <w:b/>
-                <w:bCs/>
-                <w:color w:val="14284B"/>
-                <w:sz w:val="16"/>
-                <w:szCs w:val="16"/>
-              </w:rPr>
-              <w:t xml:space="preserve">Arrendatarios:</w:t>
-            </w:r>
-            <w:r>
-              <w:rPr>
-                <w:rFonts w:ascii="Arial" w:cs="Arial" w:eastAsia="Arial" w:hAnsi="Arial"/>
-                <w:color w:val="1A1A1A"/>
-                <w:sz w:val="16"/>
-                <w:szCs w:val="16"/>
-              </w:rPr>
-              <w:t xml:space="preserve"> gestiona la relación con sus locatarios mediante un modelo de relacionamiento centrado en la propuesta de valor y la experiencia; el NPS pasó de −8% en 2022 a 13% en 2025 (Figura E4).</w:t>
-            </w:r>
-          </w:p>
-          <w:p>
-            <w:pPr>
-              <w:spacing w:after="60" w:before="0" w:line="228" w:lineRule="auto"/>
-              <w:jc w:val="both"/>
-            </w:pPr>
-            <w:r>
-              <w:rPr>
-                <w:rFonts w:ascii="Arial" w:cs="Arial" w:eastAsia="Arial" w:hAnsi="Arial"/>
-                <w:b/>
-                <w:bCs/>
-                <w:color w:val="14284B"/>
-                <w:sz w:val="16"/>
-                <w:szCs w:val="16"/>
-              </w:rPr>
-              <w:t xml:space="preserve">Seguridad y privacidad:</w:t>
-            </w:r>
-            <w:r>
-              <w:rPr>
-                <w:rFonts w:ascii="Arial" w:cs="Arial" w:eastAsia="Arial" w:hAnsi="Arial"/>
-                <w:color w:val="1A1A1A"/>
-                <w:sz w:val="16"/>
-                <w:szCs w:val="16"/>
-              </w:rPr>
-              <w:t xml:space="preserve"> cada centro cuenta con manuales de emergencia adaptados a su contexto geográfico y en 2025 realizó 52 simulacros con la comunidad. Implementó la ISO/IEC 27001 para proteger la confidencialidad, integridad y disponibilidad de la información ante riesgos cibernéticos.</w:t>
-            </w:r>
-          </w:p>
-          <w:p>
-            <w:pPr>
-              <w:spacing w:after="60" w:before="0" w:line="228" w:lineRule="auto"/>
-              <w:jc w:val="both"/>
-            </w:pPr>
-            <w:r>
-              <w:rPr>
-                <w:rFonts w:ascii="Arial" w:cs="Arial" w:eastAsia="Arial" w:hAnsi="Arial"/>
-                <w:b/>
-                <w:bCs/>
-                <w:color w:val="14284B"/>
-                <w:sz w:val="16"/>
-                <w:szCs w:val="16"/>
-              </w:rPr>
-              <w:t xml:space="preserve">Diversidad:</w:t>
-            </w:r>
-            <w:r>
-              <w:rPr>
-                <w:rFonts w:ascii="Arial" w:cs="Arial" w:eastAsia="Arial" w:hAnsi="Arial"/>
-                <w:color w:val="1A1A1A"/>
-                <w:sz w:val="16"/>
-                <w:szCs w:val="16"/>
-              </w:rPr>
-              <w:t xml:space="preserve"> las mujeres representan el 53% de la fuerza laboral (403 personas) y el 42% de los cargos directivos (44), con una brecha salarial media de 28% a nivel regional. La meta al 2028 es que el 60% de los centros esté certificado como espacio inclusivo, y Plaza obtuvo el “Sello Mayor”, que certifica su adaptación física y operacional para personas mayores.</w:t>
+              <w:t xml:space="preserve">En materia de diversidad, las mujeres representan el 53.2% de la fuerza laboral total, donde ocupan el 42% de los puestos directivos (figura E4) y hay una brecha salarial entre hombres y mujeres con Media de 28% a nivel regional. La meta al 2028 es que el 60% de los establecimientos estén certificados como espacios inclusivos, además PLAZA obtuvo “Sello Mayor”, distinción que certifica la adaptación física y operacional para las personas mayores.</w:t>
             </w:r>
           </w:p>
         </w:tc>
@@ -488,7 +365,7 @@
                 <w:sz w:val="14"/>
                 <w:szCs w:val="14"/>
               </w:rPr>
-              <w:t xml:space="preserve">Puntaje ESG de Bloomberg y ratings externos</w:t>
+              <w:t xml:space="preserve">Puntaje ESG de Bloomberg y ratings externos.</w:t>
             </w:r>
           </w:p>
           <w:p>
@@ -543,6 +420,8 @@
             <w:r>
               <w:rPr>
                 <w:rFonts w:ascii="Arial" w:cs="Arial" w:eastAsia="Arial" w:hAnsi="Arial"/>
+                <w:i w:val="false"/>
+                <w:iCs w:val="false"/>
                 <w:color w:val="5F5F5F"/>
                 <w:sz w:val="11"/>
                 <w:szCs w:val="11"/>
@@ -552,7 +431,7 @@
           </w:p>
           <w:p>
             <w:pPr>
-              <w:spacing w:after="30" w:before="110" w:line="228" w:lineRule="auto"/>
+              <w:spacing w:after="30" w:before="90" w:line="228" w:lineRule="auto"/>
             </w:pPr>
             <w:r>
               <w:rPr>
@@ -572,7 +451,7 @@
                 <w:sz w:val="14"/>
                 <w:szCs w:val="14"/>
               </w:rPr>
-              <w:t xml:space="preserve">Metas ambientales: avance a 2025</w:t>
+              <w:t xml:space="preserve">Metas ambientales: avance a 2025.</w:t>
             </w:r>
           </w:p>
           <w:p>
@@ -627,6 +506,8 @@
             <w:r>
               <w:rPr>
                 <w:rFonts w:ascii="Arial" w:cs="Arial" w:eastAsia="Arial" w:hAnsi="Arial"/>
+                <w:i w:val="false"/>
+                <w:iCs w:val="false"/>
                 <w:color w:val="5F5F5F"/>
                 <w:sz w:val="11"/>
                 <w:szCs w:val="11"/>
@@ -636,7 +517,7 @@
           </w:p>
           <w:p>
             <w:pPr>
-              <w:spacing w:after="30" w:before="110" w:line="228" w:lineRule="auto"/>
+              <w:spacing w:after="30" w:before="90" w:line="228" w:lineRule="auto"/>
             </w:pPr>
             <w:r>
               <w:rPr>
@@ -656,7 +537,7 @@
                 <w:sz w:val="14"/>
                 <w:szCs w:val="14"/>
               </w:rPr>
-              <w:t xml:space="preserve">Energía renovable y valorización de residuos, 2025</w:t>
+              <w:t xml:space="preserve">Energía renovable y valorización de residuos, 2025.</w:t>
             </w:r>
           </w:p>
           <w:p>
@@ -711,6 +592,8 @@
             <w:r>
               <w:rPr>
                 <w:rFonts w:ascii="Arial" w:cs="Arial" w:eastAsia="Arial" w:hAnsi="Arial"/>
+                <w:i w:val="false"/>
+                <w:iCs w:val="false"/>
                 <w:color w:val="5F5F5F"/>
                 <w:sz w:val="11"/>
                 <w:szCs w:val="11"/>
@@ -720,7 +603,7 @@
           </w:p>
           <w:p>
             <w:pPr>
-              <w:spacing w:after="30" w:before="110" w:line="228" w:lineRule="auto"/>
+              <w:spacing w:after="30" w:before="90" w:line="228" w:lineRule="auto"/>
             </w:pPr>
             <w:r>
               <w:rPr>
@@ -740,7 +623,7 @@
                 <w:sz w:val="14"/>
                 <w:szCs w:val="14"/>
               </w:rPr>
-              <w:t xml:space="preserve">Indicadores sociales</w:t>
+              <w:t xml:space="preserve">Indicadores sociales.</w:t>
             </w:r>
           </w:p>
           <w:p>
@@ -795,6 +678,8 @@
             <w:r>
               <w:rPr>
                 <w:rFonts w:ascii="Arial" w:cs="Arial" w:eastAsia="Arial" w:hAnsi="Arial"/>
+                <w:i w:val="false"/>
+                <w:iCs w:val="false"/>
                 <w:color w:val="5F5F5F"/>
                 <w:sz w:val="11"/>
                 <w:szCs w:val="11"/>
@@ -805,12 +690,6 @@
         </w:tc>
       </w:tr>
     </w:tbl>
-    <w:p>
-      <w:pPr>
-        <w:pageBreakBefore/>
-        <w:spacing w:after="0"/>
-      </w:pPr>
-    </w:p>
     <w:tbl>
       <w:tblPr>
         <w:tblW w:type="dxa" w:w="10666"/>
@@ -829,9 +708,6 @@
         <w:gridCol w:w="3550"/>
       </w:tblGrid>
       <w:tr>
-        <w:trPr>
-          <w:cantSplit/>
-        </w:trPr>
         <w:tc>
           <w:tcPr>
             <w:tcW w:type="dxa" w:w="6900"/>
@@ -865,7 +741,7 @@
                 <w:sz w:val="16"/>
                 <w:szCs w:val="16"/>
               </w:rPr>
-              <w:t xml:space="preserve">GOBIERNO CORPORATIVO</w:t>
+              <w:t xml:space="preserve">GOVERNANCE</w:t>
             </w:r>
           </w:p>
           <w:p>
@@ -876,89 +752,85 @@
             <w:r>
               <w:rPr>
                 <w:rFonts w:ascii="Arial" w:cs="Arial" w:eastAsia="Arial" w:hAnsi="Arial"/>
+                <w:i w:val="false"/>
+                <w:iCs w:val="false"/>
                 <w:color w:val="1A1A1A"/>
                 <w:sz w:val="16"/>
                 <w:szCs w:val="16"/>
               </w:rPr>
-              <w:t xml:space="preserve">El gobierno corporativo se rige por los principios del G20 y de la OCDE, alineado con la NCG 461 de la CMF, para asegurar una gestión transparente, con control de riesgos y una estructura sólida que dé seguimiento a la estrategia y a los compromisos ESG.</w:t>
-            </w:r>
-          </w:p>
-          <w:p>
-            <w:pPr>
-              <w:spacing w:after="60" w:before="0" w:line="228" w:lineRule="auto"/>
-              <w:jc w:val="both"/>
-            </w:pPr>
-            <w:r>
-              <w:rPr>
-                <w:rFonts w:ascii="Arial" w:cs="Arial" w:eastAsia="Arial" w:hAnsi="Arial"/>
-                <w:b/>
-                <w:bCs/>
-                <w:color w:val="14284B"/>
-                <w:sz w:val="16"/>
-                <w:szCs w:val="16"/>
-              </w:rPr>
-              <w:t xml:space="preserve">Directorio y comités:</w:t>
-            </w:r>
-            <w:r>
-              <w:rPr>
-                <w:rFonts w:ascii="Arial" w:cs="Arial" w:eastAsia="Arial" w:hAnsi="Arial"/>
+              <w:t xml:space="preserve">El gobierno corporativo se rige bajo los principios del G20 y de la OCDE, alineado con la NCG 461 de la CMF, todo esto busca una gestión transparente con control de riesgos y una estructura sólida para dar seguimiento a la estrategia corporativa y compromisos ESG. </w:t>
+            </w:r>
+            <w:r>
+              <w:rPr>
+                <w:rFonts w:ascii="Arial" w:cs="Arial" w:eastAsia="Arial" w:hAnsi="Arial"/>
+                <w:b/>
+                <w:bCs/>
+                <w:i w:val="false"/>
+                <w:iCs w:val="false"/>
+                <w:color w:val="14284B"/>
+                <w:sz w:val="16"/>
+                <w:szCs w:val="16"/>
+              </w:rPr>
+              <w:t xml:space="preserve">Structure of the board of directors and committees:</w:t>
+            </w:r>
+            <w:r>
+              <w:rPr>
+                <w:rFonts w:ascii="Arial" w:cs="Arial" w:eastAsia="Arial" w:hAnsi="Arial"/>
+                <w:i w:val="false"/>
+                <w:iCs w:val="false"/>
                 <w:color w:val="1A1A1A"/>
                 <w:sz w:val="16"/>
                 <w:szCs w:val="16"/>
               </w:rPr>
-              <w:t xml:space="preserve"> el Directorio, de 9 miembros, define los objetivos, estrategias y políticas de Plaza, pero solo uno es independiente (Figura E5). El comité de directores, de tres miembros y presidido por el director independiente, revisa las operaciones con partes relacionadas (Ley 18.046). Falabella controla el 53,05% de la propiedad y los fondos de pensiones suman 23,8% (Anexo [Y]). La baja independencia del Directorio es el principal punto débil de gobierno (RR1, Investment Risks).</w:t>
-            </w:r>
-          </w:p>
-          <w:p>
-            <w:pPr>
-              <w:spacing w:after="60" w:before="0" w:line="228" w:lineRule="auto"/>
-              <w:jc w:val="both"/>
-            </w:pPr>
-            <w:r>
-              <w:rPr>
-                <w:rFonts w:ascii="Arial" w:cs="Arial" w:eastAsia="Arial" w:hAnsi="Arial"/>
-                <w:b/>
-                <w:bCs/>
-                <w:color w:val="14284B"/>
-                <w:sz w:val="16"/>
-                <w:szCs w:val="16"/>
-              </w:rPr>
-              <w:t xml:space="preserve">Incentivos ESG:</w:t>
-            </w:r>
-            <w:r>
-              <w:rPr>
-                <w:rFonts w:ascii="Arial" w:cs="Arial" w:eastAsia="Arial" w:hAnsi="Arial"/>
+              <w:t xml:space="preserve"> En 2025 el Directorio compuesto por 9 miembros (sólo uno es catalogado como independiente; figura E5 y Anexo [Y], figura S2) es el responsable de definir objetivos, estrategias y políticas de PLAZA, mientras que el comité de directores (compuesto por 3 integrantes) busca revisar los balances y estados financieros, mitigando así los riesgos de agencia. Ambos órganos en conjunto supervisan la gestión de riesgos dirigida por el comité del equipo ejecutivo y el gerente general. En el último semestre de 2025 el gerente general Fernando de Peña Iver presentó su renuncia, pactando su efectividad al terminar el año, por lo que en 2026 asumió el cargo Pablo Pulido Sierra. </w:t>
+            </w:r>
+            <w:r>
+              <w:rPr>
+                <w:rFonts w:ascii="Arial" w:cs="Arial" w:eastAsia="Arial" w:hAnsi="Arial"/>
+                <w:b/>
+                <w:bCs/>
+                <w:i w:val="false"/>
+                <w:iCs w:val="false"/>
+                <w:color w:val="14284B"/>
+                <w:sz w:val="16"/>
+                <w:szCs w:val="16"/>
+              </w:rPr>
+              <w:t xml:space="preserve">Shareholders: </w:t>
+            </w:r>
+            <w:r>
+              <w:rPr>
+                <w:rFonts w:ascii="Arial" w:cs="Arial" w:eastAsia="Arial" w:hAnsi="Arial"/>
+                <w:i w:val="false"/>
+                <w:iCs w:val="false"/>
                 <w:color w:val="1A1A1A"/>
                 <w:sz w:val="16"/>
                 <w:szCs w:val="16"/>
               </w:rPr>
-              <w:t xml:space="preserve"> los KPIs ESG se miden anualmente y forman parte de la remuneración variable del Gerente General, gerentes y subgerentes. Los indicadores no financieros pesan 61% (33,3% vinculado directamente a materias ESG y 27,7% a otros temas) y los financieros 39% (Figura E5).</w:t>
-            </w:r>
-          </w:p>
-          <w:p>
-            <w:pPr>
-              <w:spacing w:after="60" w:before="0" w:line="228" w:lineRule="auto"/>
-              <w:jc w:val="both"/>
-            </w:pPr>
-            <w:r>
-              <w:rPr>
-                <w:rFonts w:ascii="Arial" w:cs="Arial" w:eastAsia="Arial" w:hAnsi="Arial"/>
-                <w:b/>
-                <w:bCs/>
-                <w:color w:val="14284B"/>
-                <w:sz w:val="16"/>
-                <w:szCs w:val="16"/>
-              </w:rPr>
-              <w:t xml:space="preserve">Ética y cumplimiento:</w:t>
-            </w:r>
-            <w:r>
-              <w:rPr>
-                <w:rFonts w:ascii="Arial" w:cs="Arial" w:eastAsia="Arial" w:hAnsi="Arial"/>
+              <w:t xml:space="preserve">PLAZA tiene un modelo de control concentrado, donde es controlado por Falabella S.A. medio de su filial Desarrollos Inmobiliarios SpA (53,05% de las acciones; Anexo [Y], figura S1), los minoritarios que tengan el 1% tienen derecho a proponer candidatos de director, los accionistas son el órgano superior encargado de designar al directorio, auditores externos y aprobar políticas de dividendos. </w:t>
+            </w:r>
+            <w:r>
+              <w:rPr>
+                <w:rFonts w:ascii="Arial" w:cs="Arial" w:eastAsia="Arial" w:hAnsi="Arial"/>
+                <w:b/>
+                <w:bCs/>
+                <w:i w:val="false"/>
+                <w:iCs w:val="false"/>
+                <w:color w:val="14284B"/>
+                <w:sz w:val="16"/>
+                <w:szCs w:val="16"/>
+              </w:rPr>
+              <w:t xml:space="preserve">Ethics, audits and controls:</w:t>
+            </w:r>
+            <w:r>
+              <w:rPr>
+                <w:rFonts w:ascii="Arial" w:cs="Arial" w:eastAsia="Arial" w:hAnsi="Arial"/>
+                <w:i w:val="false"/>
+                <w:iCs w:val="false"/>
                 <w:color w:val="1A1A1A"/>
                 <w:sz w:val="16"/>
                 <w:szCs w:val="16"/>
               </w:rPr>
-              <w:t xml:space="preserve"> en 2025 no registró incumplimientos de la legislación ni casos de corrupción. Registró 27 incumplimientos de derechos del consumidor (Ley 19.496), 2 de derechos laborales, 1 procedimiento de la Superintendencia del Medio Ambiente y 8 denuncias de acoso o violencia en el trabajo (Anexo [Y]).</w:t>
+              <w:t xml:space="preserve"> El marco ético está respaldado por el código de integridad y el modelo de prevención del delito, para así construir una guía de acción de la organización, además PLAZA opera la plataforma Autocompliance para el registro de reuniones con funcionarios públicos y la gestión de regalos e invitaciones, junto con un canal de integridad confidencial para el reporte de irregularidades sin riesgo para el emisor. Bajo supervisión del comité de directores se establece un modelo de control, realizando una auditoría interna reportada al comité mensualmente que monitorea las acciones correctivas, en paralelo el comité debe designar a auditores externos y agencias clasificadoras de riesgo para que analicen la compañía, además de auditar los estados financieros con auditores independientes. En cuanto a sanciones a nivel regional 2025, PLAZA no tiene sanciones a la libre competencia ni de corrupción, pero tiene 27 sanciones a los derechos de los clientes/consumidores, 2 a los derechos de los trabajadores, 1 a la superintendencia medioambiental y 8 de acoso laboral/sexual (Anexo [Y], sección 3).</w:t>
             </w:r>
           </w:p>
         </w:tc>
@@ -1020,7 +892,7 @@
                 <w:sz w:val="14"/>
                 <w:szCs w:val="14"/>
               </w:rPr>
-              <w:t xml:space="preserve">Incentivos ESG y composición del Directorio</w:t>
+              <w:t xml:space="preserve">Incentivos ESG y composición del Directorio.</w:t>
             </w:r>
           </w:p>
           <w:p>
@@ -1075,6 +947,8 @@
             <w:r>
               <w:rPr>
                 <w:rFonts w:ascii="Arial" w:cs="Arial" w:eastAsia="Arial" w:hAnsi="Arial"/>
+                <w:i w:val="false"/>
+                <w:iCs w:val="false"/>
                 <w:color w:val="5F5F5F"/>
                 <w:sz w:val="11"/>
                 <w:szCs w:val="11"/>

</xml_diff>

<commit_message>
ESG: remove ETF exposure/flows claims (DJSI/MSCI ESG indices are not tracked by ETFs); regenerate ESG and consolidated
Co-Authored-By: Claude Sonnet 5.5 <noreply@anthropic.com>
Claude-Session: https://claude.ai/code/session_0188QZHBkA8n5QL7BtmFakQg
</commit_message>
<xml_diff>
--- a/secciones/esg/documento/Mallplaza_ESG_ES.docx
+++ b/secciones/esg/documento/Mallplaza_ESG_ES.docx
@@ -94,18 +94,18 @@
                 <w:sz w:val="16"/>
                 <w:szCs w:val="16"/>
               </w:rPr>
-              <w:t xml:space="preserve"> En cuanto a los beneficios propios de la operación, la implementación de un sistema de gestión de la energía (SGE) certificado por la ISO 50.001, se traduce en un mejor desempeño energético, por ende, en una reducción de costos operativos. Las oportunidades de optar a beneficios externos locales van ligadas a la imagen ESG de la empresa, en Chile existe la ley de I+D (CORFO) donde PLAZA puede alcanzar hasta un 55% de rebaja de impuestos de 1ª categoría; Perú reconoce a la empresa con 2 estrellas de 4 en “Huella de Carbono Perú”, lo que aporta a la imagen de la empresa para obtener más fácilmente permisos y licencias dentro del país, y Colombia tiene la ley 2.099 de 2021, que permite obtener descuentos aplicables a la renta por inversiones en control, conservación y mejoramiento del medio ambiente. Además la empresa tiene certificaciones y reconocimientos que aportan a su imagen ESG, y se ha incorporado a índices como el DJSI MILA (figura E1) que le dan exposición a ETF’s.</w:t>
-            </w:r>
-            <w:r>
-              <w:rPr>
-                <w:rFonts w:ascii="Arial" w:cs="Arial" w:eastAsia="Arial" w:hAnsi="Arial"/>
-                <w:i w:val="false"/>
-                <w:iCs w:val="false"/>
-                <w:color w:val="1A1A1A"/>
-                <w:sz w:val="16"/>
-                <w:szCs w:val="16"/>
-              </w:rPr>
-              <w:t xml:space="preserve"> Según estimaciones de Morgan Stanley, la incorporación de PLAZA al índice MSCI podría generar flujos pasivos en torno a US$ 110 millones, equivalentes a cerca de 15 veces su volumen promedio diario transado, lo que fortalecería la liquidez del papel. En valor, la figura E6 estima (como escenario, no como dato) que los ahorros operativos ESG suman unos CLP 2 por acción y que una rebaja de 25 pb en el costo de la deuda y del capital propio aportaría CLP 71, frente a los CLP 1.406 que separan el precio objetivo del precio de la acción.</w:t>
+              <w:t xml:space="preserve"> En cuanto a los beneficios propios de la operación, la implementación de un sistema de gestión de la energía (SGE) certificado por la ISO 50.001, se traduce en un mejor desempeño energético, por ende, en una reducción de costos operativos. Las oportunidades de optar a beneficios externos locales van ligadas a la imagen ESG de la empresa, en Chile existe la ley de I+D (CORFO) donde PLAZA puede alcanzar hasta un 55% de rebaja de impuestos de 1ª categoría; Perú reconoce a la empresa con 2 estrellas de 4 en “Huella de Carbono Perú”, lo que aporta a la imagen de la empresa para obtener más fácilmente permisos y licencias dentro del país, y Colombia tiene la ley 2.099 de 2021, que permite obtener descuentos aplicables a la renta por inversiones en control, conservación y mejoramiento del medio ambiente. Además la empresa tiene certificaciones y reconocimientos que aportan a su imagen ESG, y se ha incorporado a índices como el DJSI MILA (figura E1).</w:t>
+            </w:r>
+            <w:r>
+              <w:rPr>
+                <w:rFonts w:ascii="Arial" w:cs="Arial" w:eastAsia="Arial" w:hAnsi="Arial"/>
+                <w:i w:val="false"/>
+                <w:iCs w:val="false"/>
+                <w:color w:val="1A1A1A"/>
+                <w:sz w:val="16"/>
+                <w:szCs w:val="16"/>
+              </w:rPr>
+              <w:t xml:space="preserve"> La figura E6 estima (como escenario, no como dato) que los ahorros operativos ESG suman unos CLP 2 por acción y que una rebaja de 25 pb en el costo de la deuda y del capital propio aportaría CLP 71, frente a los CLP 1.406 que separan el precio objetivo del precio de la acción.</w:t>
             </w:r>
           </w:p>
           <w:p>

</xml_diff>